<commit_message>
Modificação apostila cor dos olhos
Modificação apostila cor dos olhos
</commit_message>
<xml_diff>
--- a/Gimp/Mudando a Cor dos Olhos.docx
+++ b/Gimp/Mudando a Cor dos Olhos.docx
@@ -59,7 +59,13 @@
         <w:rPr>
           <w:lang w:val="pt-BR" w:bidi="pt-BR"/>
         </w:rPr>
-        <w:t xml:space="preserve">Se você quiser personalizar ainda mais o Sumário, experimente isto. (Se você não adicionou o Sumário novamente, faça isso agora. Você pode adicioná-lo acima desta seção se desejar. Ou, se removê-lo foi a última coisa que você fez, pressione Ctrl + Z para desfazer.) </w:t>
+        <w:t>Siga os passos a seguir:</w:t>
+      </w:r>
+      <w:r>
+        <w:rPr>
+          <w:lang w:val="pt-BR" w:bidi="pt-BR"/>
+        </w:rPr>
+        <w:t>e</w:t>
       </w:r>
     </w:p>
     <w:p>
@@ -310,7 +316,6 @@
         <w:rPr>
           <w:lang w:val="pt-BR" w:bidi="pt-BR"/>
         </w:rPr>
-        <w:lastRenderedPageBreak/>
         <w:t>Passo 4: O "Pulo do Gato" (Modo de Mesclagem)</w:t>
       </w:r>
     </w:p>
@@ -343,6 +348,7 @@
         <w:rPr>
           <w:lang w:val="pt-BR" w:bidi="pt-BR"/>
         </w:rPr>
+        <w:lastRenderedPageBreak/>
         <w:t>No painel de camadas, mude o Modo de Normal para Cor (Color) ou Matiz (Hue).</w:t>
       </w:r>
     </w:p>

</xml_diff>